<commit_message>
chore(session): bank monitor-ledger appends + workbook u01@1 regen before master consolidation
</commit_message>
<xml_diff>
--- a/_bmad-output/artifacts/workbooks/u01@1.docx
+++ b/_bmad-output/artifacts/workbooks/u01@1.docx
@@ -7,7 +7,7 @@
         <w:pStyle w:val="Title"/>
       </w:pPr>
       <w:r>
-        <w:t>Workbook: a-concise-closing-bridge-for-module-1-that-synthesizes-completed-mindset-work-re</w:t>
+        <w:t>Workbook: this-lesson-functions-as-a-closing-summary-and-bridge.-it-confirms-module-1-comp</w:t>
       </w:r>
     </w:p>
     <w:p>
@@ -50,17 +50,17 @@
     </w:p>
     <w:p>
       <w:r>
-        <w:t>- **`u02`** — _understand_: (objective statement unresolved for `u02` — no enrichment overlay resolved this objective on this run) (served by section(s): `sec-u02`)</w:t>
+        <w:t>- **`u03`** — _understand_: (objective statement unresolved for `u03` — no enrichment overlay resolved this objective on this run) (served by section(s): `sec-u03`)</w:t>
       </w:r>
     </w:p>
     <w:p>
       <w:r>
-        <w:t>- **`u05`** — _understand_: (objective statement unresolved for `u05` — no enrichment overlay resolved this objective on this run) (served by section(s): `sec-u05`)</w:t>
+        <w:t>- **`u04`** — _understand_: (objective statement unresolved for `u04` — no enrichment overlay resolved this objective on this run) (served by section(s): `sec-u04`)</w:t>
       </w:r>
     </w:p>
     <w:p>
       <w:r>
-        <w:t>- **`u09`** — _understand_: (objective statement unresolved for `u09` — no enrichment overlay resolved this objective on this run) (served by section(s): `sec-u09`)</w:t>
+        <w:t>- **`u08`** — _understand_: (objective statement unresolved for `u08` — no enrichment overlay resolved this objective on this run) (served by section(s): `sec-u08`)</w:t>
       </w:r>
     </w:p>
     <w:p>
@@ -88,7 +88,7 @@
     </w:p>
     <w:p>
       <w:r>
-        <w:t>&gt; Pause on the single message: the module you just completed set your innovator mindset. LEAD THE WAY isn’t a slogan—it’s your next posture. The work now is personal: how will you begin your leadership‑identity journey inside your own system? To guide that turn, we’ll briefly name the specific foundations you’ve already built, then step into the work of becoming the leader who can carry an opportunity forward.</w:t>
+        <w:t>&gt; Congratulations—Module 1 is complete. You’ve built the cognitive foundation: a way of seeing, diagnosing, and sensing opportunity inside the hospital. That matters because from this point, your mindset stops being an internal compass and starts becoming a leadership engine. Treat this as a handoff: from how you think to how you lead.</w:t>
       </w:r>
     </w:p>
     <w:p/>
@@ -109,7 +109,7 @@
     </w:p>
     <w:p>
       <w:r>
-        <w:t>&gt; The main message: three foundations are in place. You mapped the larger forces shaping the health landscape. You populated your Opportunity Radar to identify real innovation targets. Taken together, your mindset is established—exactly the prerequisites for the leadership journey that follows.</w:t>
+        <w:t>&gt; With the mindset set, let’s cross the bridge. On one side, where you’ve been is an innovation mindset—curiosity, questioning, and possibility. On the other side, where you’re going is leadership identity—owning your role, your voice, and your influence inside the health system. In Module 2 we’ll make that move explicitly, translating insight into identity so people can feel and follow your direction.</w:t>
       </w:r>
     </w:p>
     <w:p/>
@@ -130,7 +130,7 @@
     </w:p>
     <w:p>
       <w:r>
-        <w:t>&gt; Think of your gains along two dimensions. First, seeing the system: noticing structural, economic, and social currents—macro forces shaping care from the outside in. Then, targeting the opportunity: translating that awareness into concrete innovation targets; the Opportunity Radar turned perception into possibility.</w:t>
+        <w:t>&gt; Before we step fully into identity, lock in the pillars that define the mindset you just built. These pillars shift you from reactive to generative leadership: diagnose first—see the real problem before reaching for solutions; sense opportunity—notice the white space others overlook; practice cross‑functional flexibility—move across silos and disciplines; create psychological safety—so bold ideas can surface; act as an enabler—your sponsorship determines whether opportunity moves; and finally, prize execution over ideas—impact lives through action, not ideation alone.</w:t>
       </w:r>
     </w:p>
     <w:p/>
@@ -151,7 +151,7 @@
     </w:p>
     <w:p>
       <w:r>
-        <w:t>&gt; Here’s the reframing: reaction versus redesign. Reaction is living at the mercy of pressures and disruptions; redesign is acting with intention to shape the system. By contrast with reacting, redesign is the identity you’re stepping into. With that readiness in place, it’s time to face a hard truth about innovation: ideas don’t move themselves—leaders move them. Next, we’ll name what it actually takes to carry an opportunity through a complex health system.</w:t>
+        <w:t>&gt; Great innovators start by choosing the right problem. That means asking, “What is actually broken?” and pushing past presenting symptoms to surface root causes. It also means resisting premature closure—don’t anchor to the first plausible fix. And verify your diagnosis with frontline insight so the picture reflects lived operational reality. Slow down to speed up.</w:t>
       </w:r>
     </w:p>
     <w:p/>
@@ -172,7 +172,7 @@
     </w:p>
     <w:p>
       <w:r>
-        <w:t>&gt; A blunt truth: a brilliant idea without a capable champion is just a hypothesis waiting to expire. In a matrixed health system, the strength of an innovation concept is only one variable; the rest is human—navigating politics, building coalitions, and sustaining momentum. The idea needs a carrier, and that carrier is you.</w:t>
+        <w:t>&gt; Beyond diagnosis, innovation takes three reinforcing behaviors. First, opportunity sensing—train your attention to spot gaps in care, workflow friction, and unmet patient needs before they harden into crises. A separate thread is cross‑functional flexibility—build bridges across clinical, operational, and administrative lines so solutions can travel. A distinct angle is psychological safety—teams speak up and take smart risks only when leaders truly welcome candor.</w:t>
       </w:r>
     </w:p>
     <w:p/>
@@ -193,7 +193,7 @@
     </w:p>
     <w:p>
       <w:r>
-        <w:t>&gt; Here’s the turn. The opportunity is real and addressable—urgent, even. Yet the system is complex, crowded with stakeholders, competing priorities, and structural friction. Without someone equipped to navigate, persuade, and persist, progress stalls. Viability alone does not guarantee movement.</w:t>
+        <w:t>&gt; You’ve now got the pillars; the lever is you. In complex systems, opportunities live or die based on the champion. The same role can produce two outcomes: as a constraint, a leader avoids risk, hoards information, and reinforces hierarchy; as an enabler, a leader sponsors ideas, removes barriers, and builds coalition support. You are not neutral—your posture, priorities, and political capital either open or close the door.</w:t>
       </w:r>
     </w:p>
     <w:p/>
@@ -214,7 +214,7 @@
     </w:p>
     <w:p>
       <w:r>
-        <w:t>&gt; What closes that gap are specific capacities. Political savvy: navigating systems, relationships, and power dynamics with awareness and intention. Communication skills: articulating a clear, persuasive vision that moves people and organizations. And leadership identity: owning who you are as a leader—the foundation all the others grow from.</w:t>
+        <w:t>&gt; Here’s the hard truth: ideas don’t fail because they’re unoriginal; they fail because execution stalls. Compared with a great idea under weak leadership—which sinks into committees, loses momentum, and never scales—a good idea under strong leadership navigates politics, builds alliances, and reaches system‑level adoption. Execution is the differentiator: innovation success is 20% idea quality and 80% leadership execution. The mindset you’ve built is necessary—but not sufficient on its own.</w:t>
       </w:r>
     </w:p>
     <w:p/>
@@ -235,28 +235,7 @@
     </w:p>
     <w:p>
       <w:r>
-        <w:t>&gt; First, mindset built the base—you mapped forces and worked your Opportunity Radar. That feeds the next build: your leadership identity to champion an opportunity. Then the work produces momentum—the clinical problem is waiting, and the next build is the leader. The mindset is the foundation; the leader is the structure raised on it. With that hinge set, let’s preview the identity work you’ll take on next.</w:t>
-      </w:r>
-    </w:p>
-    <w:p/>
-    <w:p>
-      <w:r>
-        <w:t>&lt;!-- segment:seg-09 --&gt;</w:t>
-      </w:r>
-    </w:p>
-    <w:p>
-      <w:r>
-        <w:t>#### seg-09</w:t>
-      </w:r>
-    </w:p>
-    <w:p>
-      <w:r>
-        <w:t>&lt;!-- REVOICE-REQUIRED: writer (Paige/Sophia) -&gt; self-contained read-prose; Irene validates --&gt;</w:t>
-      </w:r>
-    </w:p>
-    <w:p>
-      <w:r>
-        <w:t>&gt; Now we move from mindset to identity. First, define your leadership identity—clarify who you are and what you stand for at your core. Then, communicate your vision so others can see it and believe in it. Finally, inspire others to join—turn a mindset into a movement around a shared cause. The opening module is complete; it’s time to step fully into your identity as a leader. See you in the next module.</w:t>
+        <w:t>&gt; Now we develop the capabilities that turn mindset into movement. First, leadership identity—clarify who you are as a leader and what you stand for in the health system. Second, strategic communication—frame your ideas compellingly for diverse stakeholders and executive audiences. Third, inspiring others—motivate teams, build coalitions, and move people toward a shared vision. That’s the path into Module 2; the clinical problem is waiting, so let’s build the leader who will solve it.</w:t>
       </w:r>
     </w:p>
     <w:p>
@@ -269,64 +248,64 @@
     </w:p>
     <w:p>
       <w:r>
-        <w:t>### Module 1 Mindset Recap Notes</w:t>
+        <w:t>### Module 1 Pillars Recap Sheet</w:t>
       </w:r>
     </w:p>
     <w:p>
       <w:r>
-        <w:t>Objective: `u02` (section `sec-u02`)</w:t>
+        <w:t>Objective: `u03` (section `sec-u03`)</w:t>
       </w:r>
     </w:p>
     <w:p>
       <w:r>
-        <w:t>Depth deferred off the slide: Short prose recap of the named Module 1 takeaways: macro forces, Opportunity Radar, and the shift from reacting to redesigning systems.</w:t>
+        <w:t>Depth deferred off the slide: A fuller written recap of the ten Module 1 pillars with brief plain-language distinctions among the concepts.</w:t>
       </w:r>
     </w:p>
     <w:p>
       <w:r>
-        <w:t>Provide the read-in-depth recap that supports the closing slide without crowding the on-screen bridge moment.</w:t>
+        <w:t>Provide the read-in-depth companion that keeps the slide recap light while preserving conceptual completeness.</w:t>
       </w:r>
     </w:p>
     <w:p/>
     <w:p>
       <w:r>
-        <w:t>### Why Leadership Determines Whether Innovation Moves</w:t>
+        <w:t>### Problem Before Solution Reflection</w:t>
       </w:r>
     </w:p>
     <w:p>
       <w:r>
-        <w:t>Objective: `u05` (section `sec-u05`)</w:t>
+        <w:t>Objective: `u04` (section `sec-u04`)</w:t>
       </w:r>
     </w:p>
     <w:p>
       <w:r>
-        <w:t>Depth deferred off the slide: Expanded explanation of the contrast between having a good idea and being able to champion it, including the exact capacities named in the source.</w:t>
+        <w:t>Depth deferred off the slide: More explanation of diagnosis before prescription, root cause versus symptom, and how the 5 Whys helps surface the lead domino.</w:t>
       </w:r>
     </w:p>
     <w:p>
       <w:r>
-        <w:t>Carry the explanatory depth off-slide so the deck can preserve emotional momentum while the workbook supports reflection and retention.</w:t>
+        <w:t>Deepen the operational-diagnosis mindset without crowding the closing deck.</w:t>
       </w:r>
     </w:p>
     <w:p/>
     <w:p>
       <w:r>
-        <w:t>### Module 2 Preview Reflection</w:t>
+        <w:t>### Preparing for Module 2 Leadership Identity</w:t>
       </w:r>
     </w:p>
     <w:p>
       <w:r>
-        <w:t>Objective: `u09` (section `sec-u09`)</w:t>
+        <w:t>Objective: `u08` (section `sec-u08`)</w:t>
       </w:r>
     </w:p>
     <w:p>
       <w:r>
-        <w:t>Depth deferred off the slide: A short reflection prompt on leadership identity, communicating vision, and inspiring others, using only the source's preview language.</w:t>
+        <w:t>Depth deferred off the slide: A fuller narrative on the coming focus areas of leadership identity, communication, and inspiring others in a complex health system.</w:t>
       </w:r>
     </w:p>
     <w:p>
       <w:r>
-        <w:t>Extend the bridge into learner reflection without loading the closing video slide with extra text.</w:t>
+        <w:t>Support transfer from Module 1 completion into Module 2 anticipation with additional reflective depth.</w:t>
       </w:r>
     </w:p>
     <w:p>
@@ -344,7 +323,7 @@
     </w:p>
     <w:p>
       <w:r>
-        <w:t>&gt; Pause on the single message: the module you just completed set your innovator mindset. LEAD THE WAY isn’t a slogan—it’s your next posture. The work now is personal: how will you begin your leadership‑identity journey inside your own system? To guide that turn, we’ll briefly name the specific foundations you’ve already built, then step into the work of becoming the leader who can carry an opportunity forward.</w:t>
+        <w:t>&gt; Congratulations—Module 1 is complete. You’ve built the cognitive foundation: a way of seeing, diagnosing, and sensing opportunity inside the hospital. That matters because from this point, your mindset stops being an internal compass and starts becoming a leadership engine. Treat this as a handoff: from how you think to how you lead.</w:t>
       </w:r>
     </w:p>
     <w:p/>
@@ -355,7 +334,7 @@
     </w:p>
     <w:p>
       <w:r>
-        <w:t>&gt; The main message: three foundations are in place. You mapped the larger forces shaping the health landscape. You populated your Opportunity Radar to identify real innovation targets. Taken together, your mindset is established—exactly the prerequisites for the leadership journey that follows.</w:t>
+        <w:t>&gt; With the mindset set, let’s cross the bridge. On one side, where you’ve been is an innovation mindset—curiosity, questioning, and possibility. On the other side, where you’re going is leadership identity—owning your role, your voice, and your influence inside the health system. In Module 2 we’ll make that move explicitly, translating insight into identity so people can feel and follow your direction.</w:t>
       </w:r>
     </w:p>
     <w:p/>
@@ -366,7 +345,7 @@
     </w:p>
     <w:p>
       <w:r>
-        <w:t>&gt; Think of your gains along two dimensions. First, seeing the system: noticing structural, economic, and social currents—macro forces shaping care from the outside in. Then, targeting the opportunity: translating that awareness into concrete innovation targets; the Opportunity Radar turned perception into possibility.</w:t>
+        <w:t>&gt; Before we step fully into identity, lock in the pillars that define the mindset you just built. These pillars shift you from reactive to generative leadership: diagnose first—see the real problem before reaching for solutions; sense opportunity—notice the white space others overlook; practice cross‑functional flexibility—move across silos and disciplines; create psychological safety—so bold ideas can surface; act as an enabler—your sponsorship determines whether opportunity moves; and finally, prize execution over ideas—impact lives through action, not ideation alone.</w:t>
       </w:r>
     </w:p>
     <w:p/>
@@ -377,7 +356,7 @@
     </w:p>
     <w:p>
       <w:r>
-        <w:t>&gt; Here’s the reframing: reaction versus redesign. Reaction is living at the mercy of pressures and disruptions; redesign is acting with intention to shape the system. By contrast with reacting, redesign is the identity you’re stepping into. With that readiness in place, it’s time to face a hard truth about innovation: ideas don’t move themselves—leaders move them. Next, we’ll name what it actually takes to carry an opportunity through a complex health system.</w:t>
+        <w:t>&gt; Great innovators start by choosing the right problem. That means asking, “What is actually broken?” and pushing past presenting symptoms to surface root causes. It also means resisting premature closure—don’t anchor to the first plausible fix. And verify your diagnosis with frontline insight so the picture reflects lived operational reality. Slow down to speed up.</w:t>
       </w:r>
     </w:p>
     <w:p/>
@@ -388,7 +367,7 @@
     </w:p>
     <w:p>
       <w:r>
-        <w:t>&gt; A blunt truth: a brilliant idea without a capable champion is just a hypothesis waiting to expire. In a matrixed health system, the strength of an innovation concept is only one variable; the rest is human—navigating politics, building coalitions, and sustaining momentum. The idea needs a carrier, and that carrier is you.</w:t>
+        <w:t>&gt; Beyond diagnosis, innovation takes three reinforcing behaviors. First, opportunity sensing—train your attention to spot gaps in care, workflow friction, and unmet patient needs before they harden into crises. A separate thread is cross‑functional flexibility—build bridges across clinical, operational, and administrative lines so solutions can travel. A distinct angle is psychological safety—teams speak up and take smart risks only when leaders truly welcome candor.</w:t>
       </w:r>
     </w:p>
     <w:p/>
@@ -399,7 +378,7 @@
     </w:p>
     <w:p>
       <w:r>
-        <w:t>&gt; Here’s the turn. The opportunity is real and addressable—urgent, even. Yet the system is complex, crowded with stakeholders, competing priorities, and structural friction. Without someone equipped to navigate, persuade, and persist, progress stalls. Viability alone does not guarantee movement.</w:t>
+        <w:t>&gt; You’ve now got the pillars; the lever is you. In complex systems, opportunities live or die based on the champion. The same role can produce two outcomes: as a constraint, a leader avoids risk, hoards information, and reinforces hierarchy; as an enabler, a leader sponsors ideas, removes barriers, and builds coalition support. You are not neutral—your posture, priorities, and political capital either open or close the door.</w:t>
       </w:r>
     </w:p>
     <w:p/>
@@ -410,7 +389,7 @@
     </w:p>
     <w:p>
       <w:r>
-        <w:t>&gt; What closes that gap are specific capacities. Political savvy: navigating systems, relationships, and power dynamics with awareness and intention. Communication skills: articulating a clear, persuasive vision that moves people and organizations. And leadership identity: owning who you are as a leader—the foundation all the others grow from.</w:t>
+        <w:t>&gt; Here’s the hard truth: ideas don’t fail because they’re unoriginal; they fail because execution stalls. Compared with a great idea under weak leadership—which sinks into committees, loses momentum, and never scales—a good idea under strong leadership navigates politics, builds alliances, and reaches system‑level adoption. Execution is the differentiator: innovation success is 20% idea quality and 80% leadership execution. The mindset you’ve built is necessary—but not sufficient on its own.</w:t>
       </w:r>
     </w:p>
     <w:p/>
@@ -421,18 +400,7 @@
     </w:p>
     <w:p>
       <w:r>
-        <w:t>&gt; First, mindset built the base—you mapped forces and worked your Opportunity Radar. That feeds the next build: your leadership identity to champion an opportunity. Then the work produces momentum—the clinical problem is waiting, and the next build is the leader. The mindset is the foundation; the leader is the structure raised on it. With that hinge set, let’s preview the identity work you’ll take on next.</w:t>
-      </w:r>
-    </w:p>
-    <w:p/>
-    <w:p>
-      <w:r>
-        <w:t>#### seg-09 (verbatim)</w:t>
-      </w:r>
-    </w:p>
-    <w:p>
-      <w:r>
-        <w:t>&gt; Now we move from mindset to identity. First, define your leadership identity—clarify who you are and what you stand for at your core. Then, communicate your vision so others can see it and believe in it. Finally, inspire others to join—turn a mindset into a movement around a shared cause. The opening module is complete; it’s time to step fully into your identity as a leader. See you in the next module.</w:t>
+        <w:t>&gt; Now we develop the capabilities that turn mindset into movement. First, leadership identity—clarify who you are as a leader and what you stand for in the health system. Second, strategic communication—frame your ideas compellingly for diverse stakeholders and executive audiences. Third, inspiring others—motivate teams, build coalitions, and move people toward a shared vision. That’s the path into Module 2; the clinical problem is waiting, so let’s build the leader who will solve it.</w:t>
       </w:r>
     </w:p>
     <w:p>
@@ -453,7 +421,7 @@
     </w:p>
     <w:p>
       <w:r>
-        <w:t>### Exercise `ex-u02-1`</w:t>
+        <w:t>### Exercise `ex-u03-1`</w:t>
       </w:r>
     </w:p>
     <w:p>
@@ -463,18 +431,18 @@
     </w:p>
     <w:p>
       <w:r>
-        <w:t>Have learners restate the major Module 1 gains in their own words before entering Module 2.</w:t>
+        <w:t>Help learners explain how the pillars relate to one another rather than treating them as isolated terms.</w:t>
       </w:r>
     </w:p>
     <w:p>
       <w:r>
-        <w:t>Answer key (source_ref: `You have mapped out the macro forces`)</w:t>
+        <w:t>Answer key (source_ref: `Core Conceptual Pillars of Module 1`)</w:t>
       </w:r>
     </w:p>
     <w:p/>
     <w:p>
       <w:r>
-        <w:t>### Exercise `ex-u05-1`</w:t>
+        <w:t>### Exercise `ex-u04-1`</w:t>
       </w:r>
     </w:p>
     <w:p>
@@ -484,18 +452,18 @@
     </w:p>
     <w:p>
       <w:r>
-        <w:t>Ask learners to distinguish between the strength of an innovation idea and the capabilities required to advance it in a health system.</w:t>
+        <w:t>Have learners distinguish visible pain points from underlying system failures using the module's problem-finding language.</w:t>
       </w:r>
     </w:p>
     <w:p>
       <w:r>
-        <w:t>Answer key (source_ref: `Having the right idea is only 10%`)</w:t>
+        <w:t>Answer key (source_ref: `The 5 Whys Framework`)</w:t>
       </w:r>
     </w:p>
     <w:p/>
     <w:p>
       <w:r>
-        <w:t>### Exercise `ex-u05-2`</w:t>
+        <w:t>### Exercise `ex-u08-1`</w:t>
       </w:r>
     </w:p>
     <w:p>
@@ -505,33 +473,12 @@
     </w:p>
     <w:p>
       <w:r>
-        <w:t>Have learners identify the specific leadership capacities named in the close.</w:t>
+        <w:t>Prompt learners to articulate why leadership capacity matters for carrying an idea through the system.</w:t>
       </w:r>
     </w:p>
     <w:p>
       <w:r>
-        <w:t>Answer key (source_ref: `political savvy`)</w:t>
-      </w:r>
-    </w:p>
-    <w:p/>
-    <w:p>
-      <w:r>
-        <w:t>### Exercise `ex-u09-1`</w:t>
-      </w:r>
-    </w:p>
-    <w:p>
-      <w:r>
-        <w:t>Bloom level: **understand**</w:t>
-      </w:r>
-    </w:p>
-    <w:p>
-      <w:r>
-        <w:t>Prompt learners to explain what Module 2 will focus on, based on the closing preview.</w:t>
-      </w:r>
-    </w:p>
-    <w:p>
-      <w:r>
-        <w:t>Answer key (source_ref: `In Module 2, we will move from Mindset to Identity.`)</w:t>
+        <w:t>Answer key (source_ref: `define who you are as a leader`)</w:t>
       </w:r>
     </w:p>
     <w:p>
@@ -544,65 +491,98 @@
     </w:p>
     <w:p>
       <w:r>
-        <w:t>### Answer — `ex-u02-1`</w:t>
+        <w:t>### Answer — `ex-u03-1`</w:t>
       </w:r>
     </w:p>
     <w:p>
       <w:r>
-        <w:t>*(worked answer pending writer; grounded by the source_ref below — source_ref: `You have mapped out the macro forces`)*</w:t>
+        <w:t>*(worked answer pending writer; grounded by the source_ref below — source_ref: `Core Conceptual Pillars of Module 1`)*</w:t>
       </w:r>
     </w:p>
     <w:p>
       <w:r>
-        <w:t>Answer key source_ref: `You have mapped out the macro forces`</w:t>
+        <w:t>Answer key source_ref: `Core Conceptual Pillars of Module 1`</w:t>
       </w:r>
     </w:p>
     <w:p/>
     <w:p>
       <w:r>
-        <w:t>### Answer — `ex-u05-1`</w:t>
+        <w:t>### Answer — `ex-u04-1`</w:t>
       </w:r>
     </w:p>
     <w:p>
       <w:r>
-        <w:t>*(worked answer pending writer; grounded by the source_ref below — source_ref: `Having the right idea is only 10%`)*</w:t>
+        <w:t>*(worked answer pending writer; grounded by the source_ref below — source_ref: `The 5 Whys Framework`)*</w:t>
       </w:r>
     </w:p>
     <w:p>
       <w:r>
-        <w:t>Answer key source_ref: `Having the right idea is only 10%`</w:t>
+        <w:t>Answer key source_ref: `The 5 Whys Framework`</w:t>
       </w:r>
     </w:p>
     <w:p/>
     <w:p>
       <w:r>
-        <w:t>### Answer — `ex-u05-2`</w:t>
+        <w:t>### Answer — `ex-u08-1`</w:t>
       </w:r>
     </w:p>
     <w:p>
       <w:r>
-        <w:t>*(worked answer pending writer; grounded by the source_ref below — source_ref: `political savvy`)*</w:t>
+        <w:t>*(worked answer pending writer; grounded by the source_ref below — source_ref: `define who you are as a leader`)*</w:t>
       </w:r>
     </w:p>
     <w:p>
       <w:r>
-        <w:t>Answer key source_ref: `political savvy`</w:t>
+        <w:t>Answer key source_ref: `define who you are as a leader`</w:t>
+      </w:r>
+    </w:p>
+    <w:p>
+      <w:pPr>
+        <w:pStyle w:val="Heading2"/>
+      </w:pPr>
+      <w:r>
+        <w:t>Research Glossary</w:t>
+      </w:r>
+    </w:p>
+    <w:p>
+      <w:r>
+        <w:t>### Data Player Automatic Generation Data Videos</w:t>
       </w:r>
     </w:p>
     <w:p/>
     <w:p>
       <w:r>
-        <w:t>### Answer — `ex-u09-1`</w:t>
+        <w:t>*Data Player Automatic Generation Data Videos: research-informed encyclopedia entry*</w:t>
       </w:r>
     </w:p>
+    <w:p/>
     <w:p>
       <w:r>
-        <w:t>*(worked answer pending writer; grounded by the source_ref below — source_ref: `In Module 2, we will move from Mindset to Identity.`)*</w:t>
+        <w:t>*Capability note: research-informed encyclopedia stub from indexed title/metadata and tier labels — not a human SME-reviewed article.*</w:t>
       </w:r>
     </w:p>
+    <w:p/>
     <w:p>
       <w:r>
-        <w:t>Answer key source_ref: `In Module 2, we will move from Mindset to Identity.`</w:t>
+        <w:t>**Data Player Automatic Generation Data Videos** is treated here as a learner-facing encyclopedia construct, not a one-line dictionary gloss. The wrangled literature for this run indexes the work “Data Player: Automatic Generation of Data Videos with Narration-Animation Interplay” as supporting context for this construct. No study findings are invented beyond that indexed title and the credibility labels on the packet row.</w:t>
+      </w:r>
+    </w:p>
+    <w:p/>
+    <w:p>
+      <w:r>
+        <w:t>Evidence standing for this entry is explicitly surfaced: hierarchy tier `T4_peer_other`, peer-reviewed, provider provenance `scite`, and triangulation status `single_provider`. Composite reliability on the triangulation receipt is 0.10. This is research-informed synthesis from tier-labeled rows — not a semantic claim↔source audit of course narration.</w:t>
+      </w:r>
+    </w:p>
+    <w:p/>
+    <w:p>
+      <w:r>
+        <w:t>Readers should treat the cited source as the authority for methods and findings; this article orients the construct and preserves provenance for downstream review.</w:t>
+      </w:r>
+    </w:p>
+    <w:p/>
+    <w:p>
+      <w:r>
+        <w:t>**Provenance:** `cite-001` · source_ref `retrieval:scite:10.1109/tvcg.2023.3327197` · https://doi.org/10.1109/tvcg.2023.3327197 · tier=T4_peer_other, peer-reviewed, provenance=scite, triangulation=single_provider, reliability=0.10</w:t>
       </w:r>
     </w:p>
     <w:p>
@@ -658,11 +638,6 @@
         <w:t>- `seg-08` -&gt; source_ref `src-slide-08`</w:t>
       </w:r>
     </w:p>
-    <w:p>
-      <w:r>
-        <w:t>- `seg-09` -&gt; source_ref `src-slide-09`</w:t>
-      </w:r>
-    </w:p>
     <w:p/>
     <w:p>
       <w:r>
@@ -682,7 +657,49 @@
     </w:p>
     <w:p>
       <w:r>
-        <w:t>- *(no cited research entries recorded on this run's research contribution (recorded explicitly-empty; no DOI'd entries fabricated))*</w:t>
+        <w:t>- Data Player: Automatic Generation of Data Videos with Narration-Animation Interplay. https://doi.org/10.1109/tvcg.2023.3327197 (provider: scite, source_ref: `retrieval:scite:10.1109/tvcg.2023.3327197`, citation_id: `cite-001`, tier=T4_peer_other, peer-reviewed, provenance=scite, triangulation=single_provider, reliability=0.10)</w:t>
+      </w:r>
+    </w:p>
+    <w:p>
+      <w:pPr>
+        <w:pStyle w:val="Heading2"/>
+      </w:pPr>
+      <w:r>
+        <w:t>Research Trends</w:t>
+      </w:r>
+    </w:p>
+    <w:p>
+      <w:r>
+        <w:t>#### Research trends</w:t>
+      </w:r>
+    </w:p>
+    <w:p/>
+    <w:p>
+      <w:r>
+        <w:t>- Indexed literature signals continuing attention to **Data Player Automatic Generation Data**, as framed by “Data Player: Automatic Generation of Data Videos with Narration-Animation Interplay”. This trend claim is research-informed from the wrangled packet row — not a forecast and not a semantic claim audit.</w:t>
+      </w:r>
+    </w:p>
+    <w:p>
+      <w:r>
+        <w:t xml:space="preserve">  - **Provenance:** `cite-001` · `retrieval:scite:10.1109/tvcg.2023.3327197` · tier=T4_peer_other, peer-reviewed, triangulation=single_provider, confidence=medium, reliability=0.10</w:t>
+      </w:r>
+    </w:p>
+    <w:p/>
+    <w:p>
+      <w:r>
+        <w:t>#### Hot topics</w:t>
+      </w:r>
+    </w:p>
+    <w:p/>
+    <w:p>
+      <w:r>
+        <w:t>*Bounded callout from wrangled evidence — not trend-forecasting theater.*</w:t>
+      </w:r>
+    </w:p>
+    <w:p/>
+    <w:p>
+      <w:r>
+        <w:t>- **Data Player Automatic Generation Data** (confidence=medium) — &lt;!-- TRENDS-WRITER-REQUIRED --&gt; Bounded hot-topic callout grounded in `cite-001` (tier=T4_peer_other, triangulation=single_provider, confidence=medium). Not a forecast. Supporting: `cite-001`; source_refs: `retrieval:scite:10.1109/tvcg.2023.3327197`.</w:t>
       </w:r>
     </w:p>
     <w:p>

</xml_diff>